<commit_message>
pushing the code to remote
</commit_message>
<xml_diff>
--- a/ReplyForge_$90K_Blueprint.docx
+++ b/ReplyForge_$90K_Blueprint.docx
@@ -1463,7 +1463,7 @@
           <w:sz w:val="22"/>
           <w:szCs w:val="22"/>
         </w:rPr>
-        <w:t xml:space="preserve">Payments: Stripe (no monthly fee — 2.9% + $0.30 per transaction only)</w:t>
+        <w:t xml:space="preserve">Payments: Razorpay (India-friendly — 2% per transaction, instant signup, supports UPI + cards + netbanking)</w:t>
       </w:r>
     </w:p>
     <w:p>
@@ -1542,7 +1542,7 @@
           <w:sz w:val="22"/>
           <w:szCs w:val="22"/>
         </w:rPr>
-        <w:t xml:space="preserve">users: id, email, stripe_customer_id, plan, status, api_key, credits_used</w:t>
+        <w:t xml:space="preserve">users: id, email, razorpay_customer_id, plan, status, api_key, credits_used</w:t>
       </w:r>
     </w:p>
     <w:p>
@@ -1638,26 +1638,26 @@
           <w:sz w:val="22"/>
           <w:szCs w:val="22"/>
         </w:rPr>
-        <w:t xml:space="preserve">app/index.html — Complete frontend SPA with Stripe integration</w:t>
-      </w:r>
-    </w:p>
-    <w:p>
-      <w:pPr>
-        <w:pStyle w:val="ListParagraph"/>
-        <w:numPr>
-          <w:ilvl w:val="0"/>
-          <w:numId w:val="2"/>
-        </w:numPr>
-        <w:spacing w:before="60" w:after="60"/>
-      </w:pPr>
-      <w:r>
-        <w:rPr>
-          <w:rFonts w:ascii="Arial" w:cs="Arial" w:eastAsia="Arial" w:hAnsi="Arial"/>
-          <w:color w:val="1A1A26"/>
-          <w:sz w:val="22"/>
-          <w:szCs w:val="22"/>
-        </w:rPr>
-        <w:t xml:space="preserve">backend/server.js — Node.js API with Stripe subscriptions + Supabase</w:t>
+        <w:t xml:space="preserve">app/index.html — Complete frontend SPA with Razorpay integration</w:t>
+      </w:r>
+    </w:p>
+    <w:p>
+      <w:pPr>
+        <w:pStyle w:val="ListParagraph"/>
+        <w:numPr>
+          <w:ilvl w:val="0"/>
+          <w:numId w:val="2"/>
+        </w:numPr>
+        <w:spacing w:before="60" w:after="60"/>
+      </w:pPr>
+      <w:r>
+        <w:rPr>
+          <w:rFonts w:ascii="Arial" w:cs="Arial" w:eastAsia="Arial" w:hAnsi="Arial"/>
+          <w:color w:val="1A1A26"/>
+          <w:sz w:val="22"/>
+          <w:szCs w:val="22"/>
+        </w:rPr>
+        <w:t xml:space="preserve">backend/server.js — Node.js API with Razorpay subscriptions + Supabase</w:t>
       </w:r>
     </w:p>
     <w:p>
@@ -1873,102 +1873,121 @@
           <w:sz w:val="28"/>
           <w:szCs w:val="28"/>
         </w:rPr>
-        <w:t xml:space="preserve">Step 2: Set Up Stripe (10 minutes)</w:t>
-      </w:r>
-    </w:p>
-    <w:p>
-      <w:pPr>
-        <w:pStyle w:val="ListParagraph"/>
-        <w:numPr>
-          <w:ilvl w:val="0"/>
-          <w:numId w:val="2"/>
-        </w:numPr>
-        <w:spacing w:before="60" w:after="60"/>
-      </w:pPr>
-      <w:r>
-        <w:rPr>
-          <w:rFonts w:ascii="Arial" w:cs="Arial" w:eastAsia="Arial" w:hAnsi="Arial"/>
-          <w:color w:val="1A1A26"/>
-          <w:sz w:val="22"/>
-          <w:szCs w:val="22"/>
-        </w:rPr>
-        <w:t xml:space="preserve">stripe.com → Create account → Dashboard</w:t>
-      </w:r>
-    </w:p>
-    <w:p>
-      <w:pPr>
-        <w:pStyle w:val="ListParagraph"/>
-        <w:numPr>
-          <w:ilvl w:val="0"/>
-          <w:numId w:val="2"/>
-        </w:numPr>
-        <w:spacing w:before="60" w:after="60"/>
-      </w:pPr>
-      <w:r>
-        <w:rPr>
-          <w:rFonts w:ascii="Arial" w:cs="Arial" w:eastAsia="Arial" w:hAnsi="Arial"/>
-          <w:color w:val="1A1A26"/>
-          <w:sz w:val="22"/>
-          <w:szCs w:val="22"/>
-        </w:rPr>
-        <w:t xml:space="preserve">Products → Create 'ReplyForge Pro' at $29/mo recurring → Copy price ID</w:t>
-      </w:r>
-    </w:p>
-    <w:p>
-      <w:pPr>
-        <w:pStyle w:val="ListParagraph"/>
-        <w:numPr>
-          <w:ilvl w:val="0"/>
-          <w:numId w:val="2"/>
-        </w:numPr>
-        <w:spacing w:before="60" w:after="60"/>
-      </w:pPr>
-      <w:r>
-        <w:rPr>
-          <w:rFonts w:ascii="Arial" w:cs="Arial" w:eastAsia="Arial" w:hAnsi="Arial"/>
-          <w:color w:val="1A1A26"/>
-          <w:sz w:val="22"/>
-          <w:szCs w:val="22"/>
-        </w:rPr>
-        <w:t xml:space="preserve">Products → Create 'ReplyForge Team' at $79/mo → Copy price ID</w:t>
-      </w:r>
-    </w:p>
-    <w:p>
-      <w:pPr>
-        <w:pStyle w:val="ListParagraph"/>
-        <w:numPr>
-          <w:ilvl w:val="0"/>
-          <w:numId w:val="2"/>
-        </w:numPr>
-        <w:spacing w:before="60" w:after="60"/>
-      </w:pPr>
-      <w:r>
-        <w:rPr>
-          <w:rFonts w:ascii="Arial" w:cs="Arial" w:eastAsia="Arial" w:hAnsi="Arial"/>
-          <w:color w:val="1A1A26"/>
-          <w:sz w:val="22"/>
-          <w:szCs w:val="22"/>
-        </w:rPr>
-        <w:t xml:space="preserve">Developers → Webhooks → Add endpoint: https://your-backend.onrender.com/api/webhook</w:t>
-      </w:r>
-    </w:p>
-    <w:p>
-      <w:pPr>
-        <w:pStyle w:val="ListParagraph"/>
-        <w:numPr>
-          <w:ilvl w:val="0"/>
-          <w:numId w:val="2"/>
-        </w:numPr>
-        <w:spacing w:before="60" w:after="60"/>
-      </w:pPr>
-      <w:r>
-        <w:rPr>
-          <w:rFonts w:ascii="Arial" w:cs="Arial" w:eastAsia="Arial" w:hAnsi="Arial"/>
-          <w:color w:val="1A1A26"/>
-          <w:sz w:val="22"/>
-          <w:szCs w:val="22"/>
-        </w:rPr>
-        <w:t xml:space="preserve">Events: customer.subscription.updated, invoice.payment_failed, invoice.payment_succeeded</w:t>
+        <w:t xml:space="preserve">Step 2: Set Up Razorpay (10 minutes)</w:t>
+      </w:r>
+    </w:p>
+    <w:p>
+      <w:pPr>
+        <w:pStyle w:val="ListParagraph"/>
+        <w:numPr>
+          <w:ilvl w:val="0"/>
+          <w:numId w:val="2"/>
+        </w:numPr>
+        <w:spacing w:before="60" w:after="60"/>
+      </w:pPr>
+      <w:r>
+        <w:rPr>
+          <w:rFonts w:ascii="Arial" w:cs="Arial" w:eastAsia="Arial" w:hAnsi="Arial"/>
+          <w:color w:val="1A1A26"/>
+          <w:sz w:val="22"/>
+          <w:szCs w:val="22"/>
+        </w:rPr>
+        <w:t xml:space="preserve">Go to razorpay.com → Sign up (instant approval, no invite needed)</w:t>
+      </w:r>
+    </w:p>
+    <w:p>
+      <w:pPr>
+        <w:pStyle w:val="ListParagraph"/>
+        <w:numPr>
+          <w:ilvl w:val="0"/>
+          <w:numId w:val="2"/>
+        </w:numPr>
+        <w:spacing w:before="60" w:after="60"/>
+      </w:pPr>
+      <w:r>
+        <w:rPr>
+          <w:rFonts w:ascii="Arial" w:cs="Arial" w:eastAsia="Arial" w:hAnsi="Arial"/>
+          <w:color w:val="1A1A26"/>
+          <w:sz w:val="22"/>
+          <w:szCs w:val="22"/>
+        </w:rPr>
+        <w:t xml:space="preserve">Settings → API Keys → Generate Test Key → Copy Key ID and Key Secret</w:t>
+      </w:r>
+    </w:p>
+    <w:p>
+      <w:pPr>
+        <w:pStyle w:val="ListParagraph"/>
+        <w:numPr>
+          <w:ilvl w:val="0"/>
+          <w:numId w:val="2"/>
+        </w:numPr>
+        <w:spacing w:before="60" w:after="60"/>
+      </w:pPr>
+      <w:r>
+        <w:rPr>
+          <w:rFonts w:ascii="Arial" w:cs="Arial" w:eastAsia="Arial" w:hAnsi="Arial"/>
+          <w:color w:val="1A1A26"/>
+          <w:sz w:val="22"/>
+          <w:szCs w:val="22"/>
+        </w:rPr>
+        <w:t xml:space="preserve">Products → Subscriptions → Plans → Create 'ReplyForge Pro' at ₹2,400/mo recurring → Copy Plan ID</w:t>
+      </w:r>
+    </w:p>
+    <w:p>
+      <w:pPr>
+        <w:pStyle w:val="ListParagraph"/>
+        <w:numPr>
+          <w:ilvl w:val="0"/>
+          <w:numId w:val="2"/>
+        </w:numPr>
+        <w:spacing w:before="60" w:after="60"/>
+      </w:pPr>
+      <w:r>
+        <w:rPr>
+          <w:rFonts w:ascii="Arial" w:cs="Arial" w:eastAsia="Arial" w:hAnsi="Arial"/>
+          <w:color w:val="1A1A26"/>
+          <w:sz w:val="22"/>
+          <w:szCs w:val="22"/>
+        </w:rPr>
+        <w:t xml:space="preserve">Products → Subscriptions → Plans → Create 'ReplyForge Team' at ₹6,600/mo → Copy Plan ID</w:t>
+      </w:r>
+    </w:p>
+    <w:p>
+      <w:pPr>
+        <w:pStyle w:val="ListParagraph"/>
+        <w:numPr>
+          <w:ilvl w:val="0"/>
+          <w:numId w:val="2"/>
+        </w:numPr>
+        <w:spacing w:before="60" w:after="60"/>
+      </w:pPr>
+      <w:r>
+        <w:rPr>
+          <w:rFonts w:ascii="Arial" w:cs="Arial" w:eastAsia="Arial" w:hAnsi="Arial"/>
+          <w:color w:val="1A1A26"/>
+          <w:sz w:val="22"/>
+          <w:szCs w:val="22"/>
+        </w:rPr>
+        <w:t xml:space="preserve">Settings → Webhooks → Add URL: https://your-backend.onrender.com/api/razorpay-webhook</w:t>
+      </w:r>
+    </w:p>
+    <w:p>
+      <w:pPr>
+        <w:pStyle w:val="ListParagraph"/>
+        <w:numPr>
+          <w:ilvl w:val="0"/>
+          <w:numId w:val="2"/>
+        </w:numPr>
+        <w:spacing w:before="60" w:after="60"/>
+      </w:pPr>
+      <w:r>
+        <w:rPr>
+          <w:rFonts w:ascii="Arial" w:cs="Arial" w:eastAsia="Arial" w:hAnsi="Arial"/>
+          <w:color w:val="1A1A26"/>
+          <w:sz w:val="22"/>
+          <w:szCs w:val="22"/>
+        </w:rPr>
+        <w:t xml:space="preserve">Events: subscription.activated, subscription.charged, subscription.cancelled, payment.failed</w:t>
       </w:r>
     </w:p>
     <w:p>
@@ -2106,7 +2125,7 @@
           <w:sz w:val="22"/>
           <w:szCs w:val="22"/>
         </w:rPr>
-        <w:t xml:space="preserve">Update STRIPE_PUBLIC_KEY and API_BASE in index.html before deploying</w:t>
+        <w:t xml:space="preserve">Update RAZORPAY_KEY_ID and API_BASE in index.html before deploying</w:t>
       </w:r>
     </w:p>
     <w:p>
@@ -2284,7 +2303,7 @@
           <w:sz w:val="22"/>
           <w:szCs w:val="22"/>
         </w:rPr>
-        <w:t xml:space="preserve">Trial: 7-day free trial with card. Most SaaS lose 60% on free trials — capture card = 2× conversion.</w:t>
+        <w:t xml:space="preserve">Trial: 7-day free trial with card. Razorpay supports trial periods on subscriptions natively — capture card = 2× conversion vs no-card free trials.</w:t>
       </w:r>
     </w:p>
     <w:p>
@@ -4570,7 +4589,7 @@
           <w:sz w:val="22"/>
           <w:szCs w:val="22"/>
         </w:rPr>
-        <w:t xml:space="preserve">Because hosting costs $0, API costs are ~$0.0003/email, and Stripe only charges on revenue, there is no fixed cost to break even. The business is profitable from the first dollar. At $29 MRR, API cost per user is ~$0.09/month (300 emails × $0.0003). Gross margin: 99.7%.</w:t>
+        <w:t xml:space="preserve">Because hosting costs $0, API costs are ~$0.0003/email, and Razorpay only charges 2% on revenue (no monthly fee), there is no fixed cost to break even. The business is profitable from the first rupee. At ₹2,400 MRR per user, API cost is ~₹7/month (300 emails × $0.0003). Gross margin: ~98%.</w:t>
       </w:r>
     </w:p>
     <w:p>

</xml_diff>